<commit_message>
Add full USDA + Open Food Facts + exercise data pipeline (CSV -> Cloud SQL)
- scripts/dataprep/*.py: prepare normalized CSVs from USDA FDC, Open Food
  Facts, free-exercise-db, and (optional) Kaggle dumps, covering the full
  datasets rather than a single subset
- db/load/staging.sql + transform.sql: bulk-load via gcloud sql import csv
  or psql \copy, then cast/convert into foods + exercises (full rebuild,
  header-safe, malformed-number-safe)
- 002_foods.sql: add brand column, source now USDA|OFF|KAGGLE, drop the
  unique (source,external_id) index (replaced by full-reload model)
- Replace the row-by-row Node seed scripts (too slow for millions of rows)
- Reorder loading so 004_form_reference runs after exercises load
- Pipeline verified end-to-end against a local PostgreSQL (UTF-8)

https://claude.ai/code/session_01UXdhGZHGoxWXnLXwftq8xW
</commit_message>
<xml_diff>
--- a/NEXT_STEPS.docx
+++ b/NEXT_STEPS.docx
@@ -120,16 +120,31 @@
         <w:t xml:space="preserve">no live USDA API</w:t>
       </w:r>
       <w:r>
-        <w:t xml:space="preserve">. The Calolean food database is built once from the USDA FoodData Central bulk download into Cloud SQL (</w:t>
-      </w:r>
-      <w:r>
-        <w:rPr>
-          <w:rStyle w:val="VerbatimChar"/>
-        </w:rPr>
-        <w:t xml:space="preserve">scripts/seed_foods_usda.mjs</w:t>
-      </w:r>
-      <w:r>
-        <w:t xml:space="preserve">); food verification hits our own database first and Open Food Facts only as a last resort.</w:t>
+        <w:t xml:space="preserve">. The Calolean food database is built from the USDA FoodData Central + Open Food Facts data dumps into Cloud SQL (prepare CSVs with</w:t>
+      </w:r>
+      <w:r>
+        <w:t xml:space="preserve"> </w:t>
+      </w:r>
+      <w:r>
+        <w:rPr>
+          <w:rStyle w:val="VerbatimChar"/>
+        </w:rPr>
+        <w:t xml:space="preserve">scripts/dataprep/*.py</w:t>
+      </w:r>
+      <w:r>
+        <w:t xml:space="preserve">, load via</w:t>
+      </w:r>
+      <w:r>
+        <w:t xml:space="preserve"> </w:t>
+      </w:r>
+      <w:r>
+        <w:rPr>
+          <w:rStyle w:val="VerbatimChar"/>
+        </w:rPr>
+        <w:t xml:space="preserve">db/load/*.sql</w:t>
+      </w:r>
+      <w:r>
+        <w:t xml:space="preserve">); food verification hits our own database first and falls back to live Open Food Facts only as a last resort.</w:t>
       </w:r>
     </w:p>
     <w:p>
@@ -2337,7 +2352,7 @@
         <w:pStyle w:val="FirstParagraph"/>
       </w:pPr>
       <w:r>
-        <w:t xml:space="preserve">One small PostgreSQL instance holds: the</w:t>
+        <w:t xml:space="preserve">One PostgreSQL instance holds: the</w:t>
       </w:r>
       <w:r>
         <w:t xml:space="preserve"> </w:t>
@@ -2353,7 +2368,7 @@
         <w:t xml:space="preserve"> </w:t>
       </w:r>
       <w:r>
-        <w:t xml:space="preserve">(built from the USDA FoodData Central bulk download — this replaces any live USDA API), the 800+ exercise catalog, the shared nutrition cache, and form-check reference angles. User personal data stays in Firestore.</w:t>
+        <w:t xml:space="preserve">(built from the USDA FoodData Central + Open Food Facts data dumps — this replaces any live USDA API), the exercise catalog (from free-exercise-db), the shared nutrition cache, and form-check reference angles. User personal data stays in Firestore.</w:t>
       </w:r>
     </w:p>
     <w:p>
@@ -2361,17 +2376,103 @@
         <w:pStyle w:val="BodyText"/>
       </w:pPr>
       <w:r>
-        <w:rPr>
-          <w:b/>
-          <w:bCs/>
-        </w:rPr>
-        <w:t xml:space="preserve">Cost:</w:t>
-      </w:r>
-      <w:r>
-        <w:t xml:space="preserve"> </w:t>
-      </w:r>
-      <w:r>
-        <w:t xml:space="preserve">your main fixed cost — smallest instance (</w:t>
+        <w:t xml:space="preserve">The data pipeline is:</w:t>
+      </w:r>
+      <w:r>
+        <w:t xml:space="preserve"> </w:t>
+      </w:r>
+      <w:r>
+        <w:rPr>
+          <w:rStyle w:val="VerbatimChar"/>
+          <w:b/>
+          <w:bCs/>
+        </w:rPr>
+        <w:t xml:space="preserve">scripts/dataprep/*.py</w:t>
+      </w:r>
+      <w:r>
+        <w:rPr>
+          <w:b/>
+          <w:bCs/>
+        </w:rPr>
+        <w:t xml:space="preserve"> </w:t>
+      </w:r>
+      <w:r>
+        <w:rPr>
+          <w:b/>
+          <w:bCs/>
+        </w:rPr>
+        <w:t xml:space="preserve">→ CSVs → Cloud SQL staging tables →</w:t>
+      </w:r>
+      <w:r>
+        <w:rPr>
+          <w:b/>
+          <w:bCs/>
+        </w:rPr>
+        <w:t xml:space="preserve"> </w:t>
+      </w:r>
+      <w:r>
+        <w:rPr>
+          <w:rStyle w:val="VerbatimChar"/>
+          <w:b/>
+          <w:bCs/>
+        </w:rPr>
+        <w:t xml:space="preserve">db/load/transform.sql</w:t>
+      </w:r>
+      <w:r>
+        <w:rPr>
+          <w:b/>
+          <w:bCs/>
+        </w:rPr>
+        <w:t xml:space="preserve">.</w:t>
+      </w:r>
+      <w:r>
+        <w:t xml:space="preserve"> </w:t>
+      </w:r>
+      <w:r>
+        <w:t xml:space="preserve">You prepare and eyeball the CSVs locally first (you’ve already done this), then load them.</w:t>
+      </w:r>
+    </w:p>
+    <w:p>
+      <w:pPr>
+        <w:pStyle w:val="BlockText"/>
+      </w:pPr>
+      <w:r>
+        <w:t xml:space="preserve">⚠️</w:t>
+      </w:r>
+      <w:r>
+        <w:t xml:space="preserve"> </w:t>
+      </w:r>
+      <w:r>
+        <w:rPr>
+          <w:b/>
+          <w:bCs/>
+        </w:rPr>
+        <w:t xml:space="preserve">Instance sizing.</w:t>
+      </w:r>
+      <w:r>
+        <w:t xml:space="preserve"> </w:t>
+      </w:r>
+      <w:r>
+        <w:t xml:space="preserve">If you load the</w:t>
+      </w:r>
+      <w:r>
+        <w:t xml:space="preserve"> </w:t>
+      </w:r>
+      <w:r>
+        <w:rPr>
+          <w:i/>
+          <w:iCs/>
+        </w:rPr>
+        <w:t xml:space="preserve">full</w:t>
+      </w:r>
+      <w:r>
+        <w:t xml:space="preserve"> </w:t>
+      </w:r>
+      <w:r>
+        <w:t xml:space="preserve">USDA Branded + Open Food Facts sets (millions of rows + a trigram index), the smallest</w:t>
+      </w:r>
+      <w:r>
+        <w:t xml:space="preserve"> </w:t>
       </w:r>
       <w:r>
         <w:rPr>
@@ -2380,20 +2481,57 @@
         <w:t xml:space="preserve">db-f1-micro</w:t>
       </w:r>
       <w:r>
-        <w:t xml:space="preserve">) ≈</w:t>
-      </w:r>
-      <w:r>
-        <w:t xml:space="preserve"> </w:t>
-      </w:r>
-      <w:r>
-        <w:rPr>
-          <w:b/>
-          <w:bCs/>
-        </w:rPr>
-        <w:t xml:space="preserve">₹1,500–2,500/month</w:t>
-      </w:r>
-      <w:r>
-        <w:t xml:space="preserve">. You can stop the instance anytime to pause billing.</w:t>
+        <w:t xml:space="preserve"> </w:t>
+      </w:r>
+      <w:r>
+        <w:t xml:space="preserve">will be slow and may run out of memory building the index. For the full datasets, pick at least a</w:t>
+      </w:r>
+      <w:r>
+        <w:t xml:space="preserve"> </w:t>
+      </w:r>
+      <w:r>
+        <w:rPr>
+          <w:b/>
+          <w:bCs/>
+        </w:rPr>
+        <w:t xml:space="preserve">2 vCPU / 8 GB</w:t>
+      </w:r>
+      <w:r>
+        <w:t xml:space="preserve"> </w:t>
+      </w:r>
+      <w:r>
+        <w:t xml:space="preserve">instance (~₹6,000–9,000/mo) for the load, then you can scale it down afterward. If you stick to the</w:t>
+      </w:r>
+      <w:r>
+        <w:t xml:space="preserve"> </w:t>
+      </w:r>
+      <w:r>
+        <w:rPr>
+          <w:b/>
+          <w:bCs/>
+        </w:rPr>
+        <w:t xml:space="preserve">generic whole-foods</w:t>
+      </w:r>
+      <w:r>
+        <w:t xml:space="preserve"> </w:t>
+      </w:r>
+      <w:r>
+        <w:t xml:space="preserve">sets (USDA Foundation + SR Legacy + Survey ≈ 20–30k foods),</w:t>
+      </w:r>
+      <w:r>
+        <w:t xml:space="preserve"> </w:t>
+      </w:r>
+      <w:r>
+        <w:rPr>
+          <w:rStyle w:val="VerbatimChar"/>
+        </w:rPr>
+        <w:t xml:space="preserve">db-f1-micro</w:t>
+      </w:r>
+      <w:r>
+        <w:t xml:space="preserve"> </w:t>
+      </w:r>
+      <w:r>
+        <w:t xml:space="preserve">(~₹1,500–2,500/mo) is fine. Decide based on whether you need branded/packaged products.</w:t>
       </w:r>
     </w:p>
     <w:p>
@@ -2498,35 +2636,6 @@
         <w:t xml:space="preserve">PostgreSQL 16</w:t>
       </w:r>
       <w:r>
-        <w:t xml:space="preserve">; Edition</w:t>
-      </w:r>
-      <w:r>
-        <w:t xml:space="preserve"> </w:t>
-      </w:r>
-      <w:r>
-        <w:rPr>
-          <w:b/>
-          <w:bCs/>
-        </w:rPr>
-        <w:t xml:space="preserve">Enterprise</w:t>
-      </w:r>
-      <w:r>
-        <w:t xml:space="preserve"> </w:t>
-      </w:r>
-      <w:r>
-        <w:t xml:space="preserve">→ preset</w:t>
-      </w:r>
-      <w:r>
-        <w:t xml:space="preserve"> </w:t>
-      </w:r>
-      <w:r>
-        <w:rPr>
-          <w:b/>
-          <w:bCs/>
-        </w:rPr>
-        <w:t xml:space="preserve">Sandbox/Shared core (db-f1-micro)</w:t>
-      </w:r>
-      <w:r>
         <w:t xml:space="preserve">; region</w:t>
       </w:r>
       <w:r>
@@ -2551,7 +2660,38 @@
         </w:numPr>
       </w:pPr>
       <w:r>
-        <w:t xml:space="preserve">Connections: Public IP is fine (the app and scripts connect through the Cloud SQL connector with IAM, not IP allowlists)</w:t>
+        <w:t xml:space="preserve">Tier:</w:t>
+      </w:r>
+      <w:r>
+        <w:t xml:space="preserve"> </w:t>
+      </w:r>
+      <w:r>
+        <w:rPr>
+          <w:rStyle w:val="VerbatimChar"/>
+        </w:rPr>
+        <w:t xml:space="preserve">db-f1-micro</w:t>
+      </w:r>
+      <w:r>
+        <w:t xml:space="preserve"> </w:t>
+      </w:r>
+      <w:r>
+        <w:t xml:space="preserve">for generic foods only,</w:t>
+      </w:r>
+      <w:r>
+        <w:t xml:space="preserve"> </w:t>
+      </w:r>
+      <w:r>
+        <w:rPr>
+          <w:b/>
+          <w:bCs/>
+        </w:rPr>
+        <w:t xml:space="preserve">or</w:t>
+      </w:r>
+      <w:r>
+        <w:t xml:space="preserve"> </w:t>
+      </w:r>
+      <w:r>
+        <w:t xml:space="preserve">a 2 vCPU / 8 GB tier if loading the full branded/OFF sets (see the warning above)</w:t>
       </w:r>
     </w:p>
     <w:p>
@@ -2563,6 +2703,18 @@
         </w:numPr>
       </w:pPr>
       <w:r>
+        <w:t xml:space="preserve">Connections: Public IP is fine (the app connects through the Cloud SQL connector with IAM)</w:t>
+      </w:r>
+    </w:p>
+    <w:p>
+      <w:pPr>
+        <w:pStyle w:val="Compact"/>
+        <w:numPr>
+          <w:ilvl w:val="1"/>
+          <w:numId w:val="1009"/>
+        </w:numPr>
+      </w:pPr>
+      <w:r>
         <w:t xml:space="preserve">Create (~10 min).</w:t>
       </w:r>
     </w:p>
@@ -2653,7 +2805,23 @@
         <w:t xml:space="preserve"> </w:t>
       </w:r>
       <w:r>
-        <w:t xml:space="preserve">→</w:t>
+        <w:t xml:space="preserve">(keep the default</w:t>
+      </w:r>
+      <w:r>
+        <w:t xml:space="preserve"> </w:t>
+      </w:r>
+      <w:r>
+        <w:rPr>
+          <w:b/>
+          <w:bCs/>
+        </w:rPr>
+        <w:t xml:space="preserve">UTF8</w:t>
+      </w:r>
+      <w:r>
+        <w:t xml:space="preserve"> </w:t>
+      </w:r>
+      <w:r>
+        <w:t xml:space="preserve">encoding — required for the exercise instructions) →</w:t>
       </w:r>
       <w:r>
         <w:t xml:space="preserve"> </w:t>
@@ -2752,7 +2920,7 @@
           <w:b/>
           <w:bCs/>
         </w:rPr>
-        <w:t xml:space="preserve">Run the migrations</w:t>
+        <w:t xml:space="preserve">Create the schema + staging tables</w:t>
       </w:r>
       <w:r>
         <w:t xml:space="preserve"> </w:t>
@@ -2935,7 +3103,7 @@
         <w:rPr>
           <w:rStyle w:val="NormalTok"/>
         </w:rPr>
-        <w:t xml:space="preserve"> db/migrations/004_form_reference.sql</w:t>
+        <w:t xml:space="preserve"> db/load/staging.sql</w:t>
       </w:r>
       <w:r>
         <w:br/>
@@ -2965,13 +3133,13 @@
           <w:b/>
           <w:bCs/>
         </w:rPr>
-        <w:t xml:space="preserve">Seed the exercise catalog</w:t>
-      </w:r>
-      <w:r>
-        <w:t xml:space="preserve"> </w:t>
-      </w:r>
-      <w:r>
-        <w:t xml:space="preserve">(~870 exercises). Still in Cloud Shell, in the repo folder:</w:t>
+        <w:t xml:space="preserve">Prepare the CSVs locally</w:t>
+      </w:r>
+      <w:r>
+        <w:t xml:space="preserve"> </w:t>
+      </w:r>
+      <w:r>
+        <w:t xml:space="preserve">(you’ve validated these already). On your machine:</w:t>
       </w:r>
     </w:p>
     <w:p>
@@ -2984,156 +3152,230 @@
       </w:pPr>
       <w:r>
         <w:rPr>
-          <w:rStyle w:val="ExtensionTok"/>
-        </w:rPr>
-        <w:t xml:space="preserve">npm</w:t>
-      </w:r>
-      <w:r>
-        <w:rPr>
-          <w:rStyle w:val="NormalTok"/>
-        </w:rPr>
-        <w:t xml:space="preserve"> install</w:t>
+          <w:rStyle w:val="NormalTok"/>
+        </w:rPr>
+        <w:t xml:space="preserve">python scripts</w:t>
+      </w:r>
+      <w:r>
+        <w:rPr>
+          <w:rStyle w:val="OperatorTok"/>
+        </w:rPr>
+        <w:t xml:space="preserve">/</w:t>
+      </w:r>
+      <w:r>
+        <w:rPr>
+          <w:rStyle w:val="NormalTok"/>
+        </w:rPr>
+        <w:t xml:space="preserve">dataprep</w:t>
+      </w:r>
+      <w:r>
+        <w:rPr>
+          <w:rStyle w:val="OperatorTok"/>
+        </w:rPr>
+        <w:t xml:space="preserve">/</w:t>
+      </w:r>
+      <w:r>
+        <w:rPr>
+          <w:rStyle w:val="NormalTok"/>
+        </w:rPr>
+        <w:t xml:space="preserve">exercises_to_csv</w:t>
+      </w:r>
+      <w:r>
+        <w:rPr>
+          <w:rStyle w:val="OperatorTok"/>
+        </w:rPr>
+        <w:t xml:space="preserve">.</w:t>
+      </w:r>
+      <w:r>
+        <w:rPr>
+          <w:rStyle w:val="FunctionTok"/>
+        </w:rPr>
+        <w:t xml:space="preserve">py</w:t>
       </w:r>
       <w:r>
         <w:br/>
       </w:r>
       <w:r>
         <w:rPr>
-          <w:rStyle w:val="BuiltInTok"/>
-        </w:rPr>
-        <w:t xml:space="preserve">export</w:t>
-      </w:r>
-      <w:r>
-        <w:rPr>
-          <w:rStyle w:val="NormalTok"/>
-        </w:rPr>
-        <w:t xml:space="preserve"> </w:t>
-      </w:r>
-      <w:r>
-        <w:rPr>
-          <w:rStyle w:val="VariableTok"/>
-        </w:rPr>
-        <w:t xml:space="preserve">CLOUD_SQL_CONNECTION_NAME</w:t>
+          <w:rStyle w:val="NormalTok"/>
+        </w:rPr>
+        <w:t xml:space="preserve">python scripts</w:t>
       </w:r>
       <w:r>
         <w:rPr>
           <w:rStyle w:val="OperatorTok"/>
         </w:rPr>
-        <w:t xml:space="preserve">=</w:t>
-      </w:r>
-      <w:r>
-        <w:rPr>
-          <w:rStyle w:val="NormalTok"/>
-        </w:rPr>
-        <w:t xml:space="preserve">... </w:t>
-      </w:r>
-      <w:r>
-        <w:rPr>
-          <w:rStyle w:val="VariableTok"/>
-        </w:rPr>
-        <w:t xml:space="preserve">CLOUD_SQL_DB</w:t>
+        <w:t xml:space="preserve">/</w:t>
+      </w:r>
+      <w:r>
+        <w:rPr>
+          <w:rStyle w:val="NormalTok"/>
+        </w:rPr>
+        <w:t xml:space="preserve">dataprep</w:t>
       </w:r>
       <w:r>
         <w:rPr>
           <w:rStyle w:val="OperatorTok"/>
         </w:rPr>
-        <w:t xml:space="preserve">=</w:t>
-      </w:r>
-      <w:r>
-        <w:rPr>
-          <w:rStyle w:val="NormalTok"/>
-        </w:rPr>
-        <w:t xml:space="preserve">calolean </w:t>
-      </w:r>
-      <w:r>
-        <w:rPr>
-          <w:rStyle w:val="VariableTok"/>
-        </w:rPr>
-        <w:t xml:space="preserve">CLOUD_SQL_USER</w:t>
+        <w:t xml:space="preserve">/</w:t>
+      </w:r>
+      <w:r>
+        <w:rPr>
+          <w:rStyle w:val="NormalTok"/>
+        </w:rPr>
+        <w:t xml:space="preserve">usda_to_csv</w:t>
       </w:r>
       <w:r>
         <w:rPr>
           <w:rStyle w:val="OperatorTok"/>
         </w:rPr>
-        <w:t xml:space="preserve">=</w:t>
-      </w:r>
-      <w:r>
-        <w:rPr>
-          <w:rStyle w:val="NormalTok"/>
-        </w:rPr>
-        <w:t xml:space="preserve">calolean_app </w:t>
-      </w:r>
-      <w:r>
-        <w:rPr>
-          <w:rStyle w:val="VariableTok"/>
-        </w:rPr>
-        <w:t xml:space="preserve">CLOUD_SQL_PASSWORD</w:t>
+        <w:t xml:space="preserve">.</w:t>
+      </w:r>
+      <w:r>
+        <w:rPr>
+          <w:rStyle w:val="FunctionTok"/>
+        </w:rPr>
+        <w:t xml:space="preserve">py</w:t>
+      </w:r>
+      <w:r>
+        <w:rPr>
+          <w:rStyle w:val="NormalTok"/>
+        </w:rPr>
+        <w:t xml:space="preserve"> </w:t>
       </w:r>
       <w:r>
         <w:rPr>
           <w:rStyle w:val="OperatorTok"/>
         </w:rPr>
-        <w:t xml:space="preserve">=</w:t>
-      </w:r>
-      <w:r>
-        <w:rPr>
-          <w:rStyle w:val="NormalTok"/>
-        </w:rPr>
-        <w:t xml:space="preserve">...</w:t>
+        <w:t xml:space="preserve">--</w:t>
+      </w:r>
+      <w:r>
+        <w:rPr>
+          <w:rStyle w:val="NormalTok"/>
+        </w:rPr>
+        <w:t xml:space="preserve">dir </w:t>
+      </w:r>
+      <w:r>
+        <w:rPr>
+          <w:rStyle w:val="StringTok"/>
+        </w:rPr>
+        <w:t xml:space="preserve">"C:\path\to\usda_folder"</w:t>
       </w:r>
       <w:r>
         <w:br/>
       </w:r>
       <w:r>
         <w:rPr>
-          <w:rStyle w:val="BuiltInTok"/>
-        </w:rPr>
-        <w:t xml:space="preserve">export</w:t>
-      </w:r>
-      <w:r>
-        <w:rPr>
-          <w:rStyle w:val="NormalTok"/>
-        </w:rPr>
-        <w:t xml:space="preserve"> </w:t>
-      </w:r>
-      <w:r>
-        <w:rPr>
-          <w:rStyle w:val="VariableTok"/>
-        </w:rPr>
-        <w:t xml:space="preserve">GCP_SERVICE_ACCOUNT_B64</w:t>
+          <w:rStyle w:val="NormalTok"/>
+        </w:rPr>
+        <w:t xml:space="preserve">python scripts</w:t>
       </w:r>
       <w:r>
         <w:rPr>
           <w:rStyle w:val="OperatorTok"/>
         </w:rPr>
-        <w:t xml:space="preserve">=</w:t>
-      </w:r>
-      <w:r>
-        <w:rPr>
-          <w:rStyle w:val="NormalTok"/>
-        </w:rPr>
-        <w:t xml:space="preserve">...   </w:t>
-      </w:r>
-      <w:r>
-        <w:rPr>
-          <w:rStyle w:val="CommentTok"/>
-        </w:rPr>
-        <w:t xml:space="preserve"># from Step 2</w:t>
-      </w:r>
-      <w:r>
-        <w:br/>
-      </w:r>
-      <w:r>
-        <w:rPr>
-          <w:rStyle w:val="ExtensionTok"/>
-        </w:rPr>
-        <w:t xml:space="preserve">node</w:t>
-      </w:r>
-      <w:r>
-        <w:rPr>
-          <w:rStyle w:val="NormalTok"/>
-        </w:rPr>
-        <w:t xml:space="preserve"> scripts/seed_exercises_cloudsql.mjs</w:t>
+        <w:t xml:space="preserve">/</w:t>
+      </w:r>
+      <w:r>
+        <w:rPr>
+          <w:rStyle w:val="NormalTok"/>
+        </w:rPr>
+        <w:t xml:space="preserve">dataprep</w:t>
+      </w:r>
+      <w:r>
+        <w:rPr>
+          <w:rStyle w:val="OperatorTok"/>
+        </w:rPr>
+        <w:t xml:space="preserve">/</w:t>
+      </w:r>
+      <w:r>
+        <w:rPr>
+          <w:rStyle w:val="NormalTok"/>
+        </w:rPr>
+        <w:t xml:space="preserve">off_to_csv</w:t>
+      </w:r>
+      <w:r>
+        <w:rPr>
+          <w:rStyle w:val="OperatorTok"/>
+        </w:rPr>
+        <w:t xml:space="preserve">.</w:t>
+      </w:r>
+      <w:r>
+        <w:rPr>
+          <w:rStyle w:val="FunctionTok"/>
+        </w:rPr>
+        <w:t xml:space="preserve">py</w:t>
+      </w:r>
+      <w:r>
+        <w:rPr>
+          <w:rStyle w:val="NormalTok"/>
+        </w:rPr>
+        <w:t xml:space="preserve">  </w:t>
+      </w:r>
+      <w:r>
+        <w:rPr>
+          <w:rStyle w:val="OperatorTok"/>
+        </w:rPr>
+        <w:t xml:space="preserve">--</w:t>
+      </w:r>
+      <w:r>
+        <w:rPr>
+          <w:rStyle w:val="NormalTok"/>
+        </w:rPr>
+        <w:t xml:space="preserve">file </w:t>
+      </w:r>
+      <w:r>
+        <w:rPr>
+          <w:rStyle w:val="StringTok"/>
+        </w:rPr>
+        <w:t xml:space="preserve">"C:\path\to\en.openfoodfacts.org.products.csv.gz"</w:t>
+      </w:r>
+    </w:p>
+    <w:p>
+      <w:pPr>
+        <w:numPr>
+          <w:ilvl w:val="0"/>
+          <w:numId w:val="1000"/>
+        </w:numPr>
+      </w:pPr>
+      <w:r>
+        <w:t xml:space="preserve">You now have</w:t>
+      </w:r>
+      <w:r>
+        <w:t xml:space="preserve"> </w:t>
+      </w:r>
+      <w:r>
+        <w:rPr>
+          <w:rStyle w:val="VerbatimChar"/>
+        </w:rPr>
+        <w:t xml:space="preserve">exercises.csv</w:t>
+      </w:r>
+      <w:r>
+        <w:t xml:space="preserve">,</w:t>
+      </w:r>
+      <w:r>
+        <w:t xml:space="preserve"> </w:t>
+      </w:r>
+      <w:r>
+        <w:rPr>
+          <w:rStyle w:val="VerbatimChar"/>
+        </w:rPr>
+        <w:t xml:space="preserve">usda_foods.csv</w:t>
+      </w:r>
+      <w:r>
+        <w:t xml:space="preserve">,</w:t>
+      </w:r>
+      <w:r>
+        <w:t xml:space="preserve"> </w:t>
+      </w:r>
+      <w:r>
+        <w:rPr>
+          <w:rStyle w:val="VerbatimChar"/>
+        </w:rPr>
+        <w:t xml:space="preserve">off_foods.csv</w:t>
+      </w:r>
+      <w:r>
+        <w:t xml:space="preserve">.</w:t>
       </w:r>
     </w:p>
     <w:p>
@@ -3154,18 +3396,49 @@
           <w:b/>
           <w:bCs/>
         </w:rPr>
-        <w:t xml:space="preserve">Build the Calolean food database from USDA.</w:t>
-      </w:r>
-      <w:r>
-        <w:t xml:space="preserve"> </w:t>
-      </w:r>
-      <w:r>
-        <w:t xml:space="preserve">Download the bulk CSV dump and seed it (one-time; re-run safely anytime — it upserts):</w:t>
-      </w:r>
-    </w:p>
-    <w:p>
-      <w:pPr>
-        <w:pStyle w:val="SourceCode"/>
+        <w:t xml:space="preserve">Load the CSVs into the staging tables.</w:t>
+      </w:r>
+      <w:r>
+        <w:t xml:space="preserve"> </w:t>
+      </w:r>
+      <w:r>
+        <w:t xml:space="preserve">Two ways — use</w:t>
+      </w:r>
+      <w:r>
+        <w:t xml:space="preserve"> </w:t>
+      </w:r>
+      <w:r>
+        <w:rPr>
+          <w:b/>
+          <w:bCs/>
+        </w:rPr>
+        <w:t xml:space="preserve">A</w:t>
+      </w:r>
+      <w:r>
+        <w:t xml:space="preserve"> </w:t>
+      </w:r>
+      <w:r>
+        <w:t xml:space="preserve">for the big food files,</w:t>
+      </w:r>
+      <w:r>
+        <w:t xml:space="preserve"> </w:t>
+      </w:r>
+      <w:r>
+        <w:rPr>
+          <w:b/>
+          <w:bCs/>
+        </w:rPr>
+        <w:t xml:space="preserve">B</w:t>
+      </w:r>
+      <w:r>
+        <w:t xml:space="preserve"> </w:t>
+      </w:r>
+      <w:r>
+        <w:t xml:space="preserve">is fine for the small exercises file:</w:t>
+      </w:r>
+    </w:p>
+    <w:p>
+      <w:pPr>
         <w:numPr>
           <w:ilvl w:val="0"/>
           <w:numId w:val="1000"/>
@@ -3173,213 +3446,534 @@
       </w:pPr>
       <w:r>
         <w:rPr>
-          <w:rStyle w:val="CommentTok"/>
-        </w:rPr>
-        <w:t xml:space="preserve"># in Cloud Shell, in the repo folder, env vars still exported:</w:t>
-      </w:r>
-      <w:r>
-        <w:br/>
-      </w:r>
-      <w:r>
-        <w:rPr>
-          <w:rStyle w:val="CommentTok"/>
-        </w:rPr>
-        <w:t xml:space="preserve"># Get the latest "SR Legacy" CSV link from https://fdc.nal.usda.gov/download-datasets</w:t>
-      </w:r>
-      <w:r>
-        <w:br/>
-      </w:r>
-      <w:r>
-        <w:rPr>
-          <w:rStyle w:val="CommentTok"/>
-        </w:rPr>
-        <w:t xml:space="preserve"># (SR Legacy = ~7,800 generic foods with per-100 g macros — ideal for matching)</w:t>
-      </w:r>
-      <w:r>
-        <w:br/>
-      </w:r>
-      <w:r>
-        <w:rPr>
-          <w:rStyle w:val="ExtensionTok"/>
-        </w:rPr>
-        <w:t xml:space="preserve">curl</w:t>
-      </w:r>
-      <w:r>
-        <w:rPr>
-          <w:rStyle w:val="NormalTok"/>
-        </w:rPr>
-        <w:t xml:space="preserve"> </w:t>
-      </w:r>
-      <w:r>
-        <w:rPr>
-          <w:rStyle w:val="AttributeTok"/>
-        </w:rPr>
-        <w:t xml:space="preserve">-LO</w:t>
-      </w:r>
-      <w:r>
-        <w:rPr>
-          <w:rStyle w:val="NormalTok"/>
-        </w:rPr>
-        <w:t xml:space="preserve"> https://fdc.nal.usda.gov/fdc-datasets/FoodData_Central_sr_legacy_food_csv_2018-04.zip</w:t>
-      </w:r>
-      <w:r>
-        <w:br/>
-      </w:r>
-      <w:r>
-        <w:rPr>
-          <w:rStyle w:val="FunctionTok"/>
-        </w:rPr>
-        <w:t xml:space="preserve">unzip</w:t>
-      </w:r>
-      <w:r>
-        <w:rPr>
-          <w:rStyle w:val="NormalTok"/>
-        </w:rPr>
-        <w:t xml:space="preserve"> </w:t>
-      </w:r>
-      <w:r>
-        <w:rPr>
-          <w:rStyle w:val="AttributeTok"/>
-        </w:rPr>
-        <w:t xml:space="preserve">-o</w:t>
-      </w:r>
-      <w:r>
-        <w:rPr>
-          <w:rStyle w:val="NormalTok"/>
-        </w:rPr>
-        <w:t xml:space="preserve"> FoodData_Central_sr_legacy_food_csv_</w:t>
-      </w:r>
-      <w:r>
-        <w:rPr>
-          <w:rStyle w:val="PreprocessorTok"/>
-        </w:rPr>
-        <w:t xml:space="preserve">*</w:t>
-      </w:r>
-      <w:r>
-        <w:rPr>
-          <w:rStyle w:val="NormalTok"/>
-        </w:rPr>
-        <w:t xml:space="preserve">.zip </w:t>
-      </w:r>
-      <w:r>
-        <w:rPr>
-          <w:rStyle w:val="AttributeTok"/>
-        </w:rPr>
-        <w:t xml:space="preserve">-d</w:t>
-      </w:r>
-      <w:r>
-        <w:rPr>
-          <w:rStyle w:val="NormalTok"/>
-        </w:rPr>
-        <w:t xml:space="preserve"> usda_csv</w:t>
-      </w:r>
-      <w:r>
-        <w:br/>
-      </w:r>
-      <w:r>
-        <w:rPr>
-          <w:rStyle w:val="ExtensionTok"/>
-        </w:rPr>
-        <w:t xml:space="preserve">node</w:t>
-      </w:r>
-      <w:r>
-        <w:rPr>
-          <w:rStyle w:val="NormalTok"/>
-        </w:rPr>
-        <w:t xml:space="preserve"> scripts/seed_foods_usda.mjs </w:t>
-      </w:r>
-      <w:r>
-        <w:rPr>
-          <w:rStyle w:val="AttributeTok"/>
-        </w:rPr>
-        <w:t xml:space="preserve">--dir</w:t>
-      </w:r>
-      <w:r>
-        <w:rPr>
-          <w:rStyle w:val="NormalTok"/>
-        </w:rPr>
-        <w:t xml:space="preserve"> usda_csv/</w:t>
-      </w:r>
-      <w:r>
-        <w:rPr>
-          <w:rStyle w:val="VariableTok"/>
-        </w:rPr>
-        <w:t xml:space="preserve">$(</w:t>
-      </w:r>
-      <w:r>
-        <w:rPr>
-          <w:rStyle w:val="FunctionTok"/>
-        </w:rPr>
-        <w:t xml:space="preserve">ls</w:t>
-      </w:r>
-      <w:r>
-        <w:rPr>
-          <w:rStyle w:val="NormalTok"/>
-        </w:rPr>
-        <w:t xml:space="preserve"> usda_csv</w:t>
-      </w:r>
-      <w:r>
-        <w:rPr>
-          <w:rStyle w:val="VariableTok"/>
-        </w:rPr>
-        <w:t xml:space="preserve">)</w:t>
-      </w:r>
-    </w:p>
-    <w:p>
-      <w:pPr>
+          <w:b/>
+          <w:bCs/>
+        </w:rPr>
+        <w:t xml:space="preserve">A) Recommended for large files — import via a Cloud Storage bucket:</w:t>
+      </w:r>
+    </w:p>
+    <w:p>
+      <w:pPr>
+        <w:pStyle w:val="SourceCode"/>
         <w:numPr>
           <w:ilvl w:val="0"/>
           <w:numId w:val="1000"/>
         </w:numPr>
       </w:pPr>
       <w:r>
-        <w:t xml:space="preserve">Expected output:</w:t>
-      </w:r>
-      <w:r>
-        <w:t xml:space="preserve"> </w:t>
-      </w:r>
-      <w:r>
-        <w:rPr>
-          <w:rStyle w:val="VerbatimChar"/>
-        </w:rPr>
-        <w:t xml:space="preserve">Seeded ~7,8xx foods</w:t>
-      </w:r>
-      <w:r>
-        <w:t xml:space="preserve">. Optionally repeat with the</w:t>
-      </w:r>
-      <w:r>
-        <w:t xml:space="preserve"> </w:t>
-      </w:r>
-      <w:r>
-        <w:rPr>
-          <w:b/>
-          <w:bCs/>
-        </w:rPr>
-        <w:t xml:space="preserve">Foundation Foods</w:t>
-      </w:r>
-      <w:r>
-        <w:t xml:space="preserve"> </w:t>
-      </w:r>
-      <w:r>
-        <w:t xml:space="preserve">CSV dataset from the same page for newer lab-analyzed entries (same command, different</w:t>
-      </w:r>
-      <w:r>
-        <w:t xml:space="preserve"> </w:t>
-      </w:r>
-      <w:r>
-        <w:rPr>
-          <w:rStyle w:val="VerbatimChar"/>
-        </w:rPr>
-        <w:t xml:space="preserve">--dir</w:t>
-      </w:r>
-      <w:r>
-        <w:t xml:space="preserve">).</w:t>
-      </w:r>
-      <w:r>
-        <w:t xml:space="preserve"> </w:t>
-      </w:r>
-      <w:r>
-        <w:t xml:space="preserve">ℹ️ Future refreshes: USDA publishes new dumps twice a year — just download the new zip and re-run the script.</w:t>
+        <w:rPr>
+          <w:rStyle w:val="CommentTok"/>
+        </w:rPr>
+        <w:t xml:space="preserve"># one-time bucket</w:t>
+      </w:r>
+      <w:r>
+        <w:br/>
+      </w:r>
+      <w:r>
+        <w:rPr>
+          <w:rStyle w:val="ExtensionTok"/>
+        </w:rPr>
+        <w:t xml:space="preserve">gcloud</w:t>
+      </w:r>
+      <w:r>
+        <w:rPr>
+          <w:rStyle w:val="NormalTok"/>
+        </w:rPr>
+        <w:t xml:space="preserve"> storage buckets create gs://calolean-data </w:t>
+      </w:r>
+      <w:r>
+        <w:rPr>
+          <w:rStyle w:val="AttributeTok"/>
+        </w:rPr>
+        <w:t xml:space="preserve">--location</w:t>
+      </w:r>
+      <w:r>
+        <w:rPr>
+          <w:rStyle w:val="OperatorTok"/>
+        </w:rPr>
+        <w:t xml:space="preserve">=</w:t>
+      </w:r>
+      <w:r>
+        <w:rPr>
+          <w:rStyle w:val="NormalTok"/>
+        </w:rPr>
+        <w:t xml:space="preserve">asia-south1</w:t>
+      </w:r>
+      <w:r>
+        <w:br/>
+      </w:r>
+      <w:r>
+        <w:rPr>
+          <w:rStyle w:val="CommentTok"/>
+        </w:rPr>
+        <w:t xml:space="preserve"># upload (run from where your CSVs are)</w:t>
+      </w:r>
+      <w:r>
+        <w:br/>
+      </w:r>
+      <w:r>
+        <w:rPr>
+          <w:rStyle w:val="ExtensionTok"/>
+        </w:rPr>
+        <w:t xml:space="preserve">gcloud</w:t>
+      </w:r>
+      <w:r>
+        <w:rPr>
+          <w:rStyle w:val="NormalTok"/>
+        </w:rPr>
+        <w:t xml:space="preserve"> storage cp exercises.csv usda_foods.csv off_foods.csv gs://calolean-data/</w:t>
+      </w:r>
+      <w:r>
+        <w:br/>
+      </w:r>
+      <w:r>
+        <w:rPr>
+          <w:rStyle w:val="CommentTok"/>
+        </w:rPr>
+        <w:t xml:space="preserve"># grant the Cloud SQL service account read access (the console will name it if this errors)</w:t>
+      </w:r>
+      <w:r>
+        <w:br/>
+      </w:r>
+      <w:r>
+        <w:rPr>
+          <w:rStyle w:val="CommentTok"/>
+        </w:rPr>
+        <w:t xml:space="preserve"># then import each CSV into its staging table:</w:t>
+      </w:r>
+      <w:r>
+        <w:br/>
+      </w:r>
+      <w:r>
+        <w:rPr>
+          <w:rStyle w:val="ExtensionTok"/>
+        </w:rPr>
+        <w:t xml:space="preserve">gcloud</w:t>
+      </w:r>
+      <w:r>
+        <w:rPr>
+          <w:rStyle w:val="NormalTok"/>
+        </w:rPr>
+        <w:t xml:space="preserve"> sql import csv calolean-db gs://calolean-data/usda_foods.csv </w:t>
+      </w:r>
+      <w:r>
+        <w:rPr>
+          <w:rStyle w:val="AttributeTok"/>
+        </w:rPr>
+        <w:t xml:space="preserve">--database</w:t>
+      </w:r>
+      <w:r>
+        <w:rPr>
+          <w:rStyle w:val="OperatorTok"/>
+        </w:rPr>
+        <w:t xml:space="preserve">=</w:t>
+      </w:r>
+      <w:r>
+        <w:rPr>
+          <w:rStyle w:val="NormalTok"/>
+        </w:rPr>
+        <w:t xml:space="preserve">calolean </w:t>
+      </w:r>
+      <w:r>
+        <w:rPr>
+          <w:rStyle w:val="AttributeTok"/>
+        </w:rPr>
+        <w:t xml:space="preserve">--table</w:t>
+      </w:r>
+      <w:r>
+        <w:rPr>
+          <w:rStyle w:val="OperatorTok"/>
+        </w:rPr>
+        <w:t xml:space="preserve">=</w:t>
+      </w:r>
+      <w:r>
+        <w:rPr>
+          <w:rStyle w:val="NormalTok"/>
+        </w:rPr>
+        <w:t xml:space="preserve">stg_foods </w:t>
+      </w:r>
+      <w:r>
+        <w:rPr>
+          <w:rStyle w:val="AttributeTok"/>
+        </w:rPr>
+        <w:t xml:space="preserve">--quiet</w:t>
+      </w:r>
+      <w:r>
+        <w:br/>
+      </w:r>
+      <w:r>
+        <w:rPr>
+          <w:rStyle w:val="ExtensionTok"/>
+        </w:rPr>
+        <w:t xml:space="preserve">gcloud</w:t>
+      </w:r>
+      <w:r>
+        <w:rPr>
+          <w:rStyle w:val="NormalTok"/>
+        </w:rPr>
+        <w:t xml:space="preserve"> sql import csv calolean-db gs://calolean-data/off_foods.csv  </w:t>
+      </w:r>
+      <w:r>
+        <w:rPr>
+          <w:rStyle w:val="AttributeTok"/>
+        </w:rPr>
+        <w:t xml:space="preserve">--database</w:t>
+      </w:r>
+      <w:r>
+        <w:rPr>
+          <w:rStyle w:val="OperatorTok"/>
+        </w:rPr>
+        <w:t xml:space="preserve">=</w:t>
+      </w:r>
+      <w:r>
+        <w:rPr>
+          <w:rStyle w:val="NormalTok"/>
+        </w:rPr>
+        <w:t xml:space="preserve">calolean </w:t>
+      </w:r>
+      <w:r>
+        <w:rPr>
+          <w:rStyle w:val="AttributeTok"/>
+        </w:rPr>
+        <w:t xml:space="preserve">--table</w:t>
+      </w:r>
+      <w:r>
+        <w:rPr>
+          <w:rStyle w:val="OperatorTok"/>
+        </w:rPr>
+        <w:t xml:space="preserve">=</w:t>
+      </w:r>
+      <w:r>
+        <w:rPr>
+          <w:rStyle w:val="NormalTok"/>
+        </w:rPr>
+        <w:t xml:space="preserve">stg_foods </w:t>
+      </w:r>
+      <w:r>
+        <w:rPr>
+          <w:rStyle w:val="AttributeTok"/>
+        </w:rPr>
+        <w:t xml:space="preserve">--quiet</w:t>
+      </w:r>
+      <w:r>
+        <w:br/>
+      </w:r>
+      <w:r>
+        <w:rPr>
+          <w:rStyle w:val="ExtensionTok"/>
+        </w:rPr>
+        <w:t xml:space="preserve">gcloud</w:t>
+      </w:r>
+      <w:r>
+        <w:rPr>
+          <w:rStyle w:val="NormalTok"/>
+        </w:rPr>
+        <w:t xml:space="preserve"> sql import csv calolean-db gs://calolean-data/exercises.csv  </w:t>
+      </w:r>
+      <w:r>
+        <w:rPr>
+          <w:rStyle w:val="AttributeTok"/>
+        </w:rPr>
+        <w:t xml:space="preserve">--database</w:t>
+      </w:r>
+      <w:r>
+        <w:rPr>
+          <w:rStyle w:val="OperatorTok"/>
+        </w:rPr>
+        <w:t xml:space="preserve">=</w:t>
+      </w:r>
+      <w:r>
+        <w:rPr>
+          <w:rStyle w:val="NormalTok"/>
+        </w:rPr>
+        <w:t xml:space="preserve">calolean </w:t>
+      </w:r>
+      <w:r>
+        <w:rPr>
+          <w:rStyle w:val="AttributeTok"/>
+        </w:rPr>
+        <w:t xml:space="preserve">--table</w:t>
+      </w:r>
+      <w:r>
+        <w:rPr>
+          <w:rStyle w:val="OperatorTok"/>
+        </w:rPr>
+        <w:t xml:space="preserve">=</w:t>
+      </w:r>
+      <w:r>
+        <w:rPr>
+          <w:rStyle w:val="NormalTok"/>
+        </w:rPr>
+        <w:t xml:space="preserve">stg_exercises </w:t>
+      </w:r>
+      <w:r>
+        <w:rPr>
+          <w:rStyle w:val="AttributeTok"/>
+        </w:rPr>
+        <w:t xml:space="preserve">--quiet</w:t>
+      </w:r>
+    </w:p>
+    <w:p>
+      <w:pPr>
+        <w:numPr>
+          <w:ilvl w:val="0"/>
+          <w:numId w:val="1000"/>
+        </w:numPr>
+      </w:pPr>
+      <w:r>
+        <w:rPr>
+          <w:b/>
+          <w:bCs/>
+        </w:rPr>
+        <w:t xml:space="preserve">B) Simpler for small files — psql</w:t>
+      </w:r>
+      <w:r>
+        <w:rPr>
+          <w:b/>
+          <w:bCs/>
+        </w:rPr>
+        <w:t xml:space="preserve"> </w:t>
+      </w:r>
+      <w:r>
+        <w:rPr>
+          <w:rStyle w:val="VerbatimChar"/>
+          <w:b/>
+          <w:bCs/>
+        </w:rPr>
+        <w:t xml:space="preserve">\copy</w:t>
+      </w:r>
+      <w:r>
+        <w:rPr>
+          <w:b/>
+          <w:bCs/>
+        </w:rPr>
+        <w:t xml:space="preserve"> </w:t>
+      </w:r>
+      <w:r>
+        <w:rPr>
+          <w:b/>
+          <w:bCs/>
+        </w:rPr>
+        <w:t xml:space="preserve">(streams from your machine):</w:t>
+      </w:r>
+    </w:p>
+    <w:p>
+      <w:pPr>
+        <w:pStyle w:val="SourceCode"/>
+        <w:numPr>
+          <w:ilvl w:val="0"/>
+          <w:numId w:val="1000"/>
+        </w:numPr>
+      </w:pPr>
+      <w:r>
+        <w:rPr>
+          <w:rStyle w:val="ExtensionTok"/>
+        </w:rPr>
+        <w:t xml:space="preserve">gcloud</w:t>
+      </w:r>
+      <w:r>
+        <w:rPr>
+          <w:rStyle w:val="NormalTok"/>
+        </w:rPr>
+        <w:t xml:space="preserve"> sql connect calolean-db </w:t>
+      </w:r>
+      <w:r>
+        <w:rPr>
+          <w:rStyle w:val="AttributeTok"/>
+        </w:rPr>
+        <w:t xml:space="preserve">--user</w:t>
+      </w:r>
+      <w:r>
+        <w:rPr>
+          <w:rStyle w:val="OperatorTok"/>
+        </w:rPr>
+        <w:t xml:space="preserve">=</w:t>
+      </w:r>
+      <w:r>
+        <w:rPr>
+          <w:rStyle w:val="NormalTok"/>
+        </w:rPr>
+        <w:t xml:space="preserve">calolean_app </w:t>
+      </w:r>
+      <w:r>
+        <w:rPr>
+          <w:rStyle w:val="AttributeTok"/>
+        </w:rPr>
+        <w:t xml:space="preserve">--database</w:t>
+      </w:r>
+      <w:r>
+        <w:rPr>
+          <w:rStyle w:val="OperatorTok"/>
+        </w:rPr>
+        <w:t xml:space="preserve">=</w:t>
+      </w:r>
+      <w:r>
+        <w:rPr>
+          <w:rStyle w:val="NormalTok"/>
+        </w:rPr>
+        <w:t xml:space="preserve">calolean</w:t>
+      </w:r>
+      <w:r>
+        <w:br/>
+      </w:r>
+      <w:r>
+        <w:rPr>
+          <w:rStyle w:val="CommentTok"/>
+        </w:rPr>
+        <w:t xml:space="preserve"># in psql, from the folder containing the CSVs:</w:t>
+      </w:r>
+      <w:r>
+        <w:br/>
+      </w:r>
+      <w:r>
+        <w:rPr>
+          <w:rStyle w:val="ExtensionTok"/>
+        </w:rPr>
+        <w:t xml:space="preserve">\copy</w:t>
+      </w:r>
+      <w:r>
+        <w:rPr>
+          <w:rStyle w:val="NormalTok"/>
+        </w:rPr>
+        <w:t xml:space="preserve"> stg_foods FROM </w:t>
+      </w:r>
+      <w:r>
+        <w:rPr>
+          <w:rStyle w:val="StringTok"/>
+        </w:rPr>
+        <w:t xml:space="preserve">'usda_foods.csv'</w:t>
+      </w:r>
+      <w:r>
+        <w:rPr>
+          <w:rStyle w:val="NormalTok"/>
+        </w:rPr>
+        <w:t xml:space="preserve"> WITH </w:t>
+      </w:r>
+      <w:r>
+        <w:rPr>
+          <w:rStyle w:val="ErrorTok"/>
+        </w:rPr>
+        <w:t xml:space="preserve">(</w:t>
+      </w:r>
+      <w:r>
+        <w:rPr>
+          <w:rStyle w:val="ExtensionTok"/>
+        </w:rPr>
+        <w:t xml:space="preserve">FORMAT</w:t>
+      </w:r>
+      <w:r>
+        <w:rPr>
+          <w:rStyle w:val="NormalTok"/>
+        </w:rPr>
+        <w:t xml:space="preserve"> csv, HEADER true</w:t>
+      </w:r>
+      <w:r>
+        <w:rPr>
+          <w:rStyle w:val="KeywordTok"/>
+        </w:rPr>
+        <w:t xml:space="preserve">)</w:t>
+      </w:r>
+      <w:r>
+        <w:br/>
+      </w:r>
+      <w:r>
+        <w:rPr>
+          <w:rStyle w:val="ExtensionTok"/>
+        </w:rPr>
+        <w:t xml:space="preserve">\copy</w:t>
+      </w:r>
+      <w:r>
+        <w:rPr>
+          <w:rStyle w:val="NormalTok"/>
+        </w:rPr>
+        <w:t xml:space="preserve"> stg_foods FROM </w:t>
+      </w:r>
+      <w:r>
+        <w:rPr>
+          <w:rStyle w:val="StringTok"/>
+        </w:rPr>
+        <w:t xml:space="preserve">'off_foods.csv'</w:t>
+      </w:r>
+      <w:r>
+        <w:rPr>
+          <w:rStyle w:val="NormalTok"/>
+        </w:rPr>
+        <w:t xml:space="preserve">  WITH </w:t>
+      </w:r>
+      <w:r>
+        <w:rPr>
+          <w:rStyle w:val="ErrorTok"/>
+        </w:rPr>
+        <w:t xml:space="preserve">(</w:t>
+      </w:r>
+      <w:r>
+        <w:rPr>
+          <w:rStyle w:val="ExtensionTok"/>
+        </w:rPr>
+        <w:t xml:space="preserve">FORMAT</w:t>
+      </w:r>
+      <w:r>
+        <w:rPr>
+          <w:rStyle w:val="NormalTok"/>
+        </w:rPr>
+        <w:t xml:space="preserve"> csv, HEADER true</w:t>
+      </w:r>
+      <w:r>
+        <w:rPr>
+          <w:rStyle w:val="KeywordTok"/>
+        </w:rPr>
+        <w:t xml:space="preserve">)</w:t>
+      </w:r>
+      <w:r>
+        <w:br/>
+      </w:r>
+      <w:r>
+        <w:rPr>
+          <w:rStyle w:val="ExtensionTok"/>
+        </w:rPr>
+        <w:t xml:space="preserve">\copy</w:t>
+      </w:r>
+      <w:r>
+        <w:rPr>
+          <w:rStyle w:val="NormalTok"/>
+        </w:rPr>
+        <w:t xml:space="preserve"> stg_exercises FROM </w:t>
+      </w:r>
+      <w:r>
+        <w:rPr>
+          <w:rStyle w:val="StringTok"/>
+        </w:rPr>
+        <w:t xml:space="preserve">'exercises.csv'</w:t>
+      </w:r>
+      <w:r>
+        <w:rPr>
+          <w:rStyle w:val="NormalTok"/>
+        </w:rPr>
+        <w:t xml:space="preserve"> WITH </w:t>
+      </w:r>
+      <w:r>
+        <w:rPr>
+          <w:rStyle w:val="ErrorTok"/>
+        </w:rPr>
+        <w:t xml:space="preserve">(</w:t>
+      </w:r>
+      <w:r>
+        <w:rPr>
+          <w:rStyle w:val="ExtensionTok"/>
+        </w:rPr>
+        <w:t xml:space="preserve">FORMAT</w:t>
+      </w:r>
+      <w:r>
+        <w:rPr>
+          <w:rStyle w:val="NormalTok"/>
+        </w:rPr>
+        <w:t xml:space="preserve"> csv, HEADER true</w:t>
+      </w:r>
+      <w:r>
+        <w:rPr>
+          <w:rStyle w:val="KeywordTok"/>
+        </w:rPr>
+        <w:t xml:space="preserve">)</w:t>
       </w:r>
     </w:p>
     <w:p>
@@ -3390,16 +3984,158 @@
         </w:numPr>
       </w:pPr>
       <w:r>
-        <w:t xml:space="preserve">☐ Quick verify in psql (</w:t>
-      </w:r>
-      <w:r>
-        <w:rPr>
-          <w:rStyle w:val="VerbatimChar"/>
-        </w:rPr>
-        <w:t xml:space="preserve">gcloud sql connect ...</w:t>
-      </w:r>
-      <w:r>
-        <w:t xml:space="preserve">):</w:t>
+        <w:t xml:space="preserve">☐</w:t>
+      </w:r>
+      <w:r>
+        <w:t xml:space="preserve"> </w:t>
+      </w:r>
+      <w:r>
+        <w:rPr>
+          <w:b/>
+          <w:bCs/>
+        </w:rPr>
+        <w:t xml:space="preserve">Transform staging → real tables, then apply form references.</w:t>
+      </w:r>
+      <w:r>
+        <w:t xml:space="preserve"> </w:t>
+      </w:r>
+      <w:r>
+        <w:t xml:space="preserve">In psql:</w:t>
+      </w:r>
+    </w:p>
+    <w:p>
+      <w:pPr>
+        <w:pStyle w:val="SourceCode"/>
+        <w:numPr>
+          <w:ilvl w:val="0"/>
+          <w:numId w:val="1000"/>
+        </w:numPr>
+      </w:pPr>
+      <w:r>
+        <w:rPr>
+          <w:rStyle w:val="ExtensionTok"/>
+        </w:rPr>
+        <w:t xml:space="preserve">gcloud</w:t>
+      </w:r>
+      <w:r>
+        <w:rPr>
+          <w:rStyle w:val="NormalTok"/>
+        </w:rPr>
+        <w:t xml:space="preserve"> sql connect calolean-db </w:t>
+      </w:r>
+      <w:r>
+        <w:rPr>
+          <w:rStyle w:val="AttributeTok"/>
+        </w:rPr>
+        <w:t xml:space="preserve">--user</w:t>
+      </w:r>
+      <w:r>
+        <w:rPr>
+          <w:rStyle w:val="OperatorTok"/>
+        </w:rPr>
+        <w:t xml:space="preserve">=</w:t>
+      </w:r>
+      <w:r>
+        <w:rPr>
+          <w:rStyle w:val="NormalTok"/>
+        </w:rPr>
+        <w:t xml:space="preserve">calolean_app </w:t>
+      </w:r>
+      <w:r>
+        <w:rPr>
+          <w:rStyle w:val="AttributeTok"/>
+        </w:rPr>
+        <w:t xml:space="preserve">--database</w:t>
+      </w:r>
+      <w:r>
+        <w:rPr>
+          <w:rStyle w:val="OperatorTok"/>
+        </w:rPr>
+        <w:t xml:space="preserve">=</w:t>
+      </w:r>
+      <w:r>
+        <w:rPr>
+          <w:rStyle w:val="NormalTok"/>
+        </w:rPr>
+        <w:t xml:space="preserve">calolean</w:t>
+      </w:r>
+      <w:r>
+        <w:br/>
+      </w:r>
+      <w:r>
+        <w:rPr>
+          <w:rStyle w:val="ExtensionTok"/>
+        </w:rPr>
+        <w:t xml:space="preserve">\i</w:t>
+      </w:r>
+      <w:r>
+        <w:rPr>
+          <w:rStyle w:val="NormalTok"/>
+        </w:rPr>
+        <w:t xml:space="preserve"> db/load/transform.sql               </w:t>
+      </w:r>
+      <w:r>
+        <w:rPr>
+          <w:rStyle w:val="CommentTok"/>
+        </w:rPr>
+        <w:t xml:space="preserve"># builds foods + exercises, prints row counts</w:t>
+      </w:r>
+      <w:r>
+        <w:br/>
+      </w:r>
+      <w:r>
+        <w:rPr>
+          <w:rStyle w:val="ExtensionTok"/>
+        </w:rPr>
+        <w:t xml:space="preserve">\i</w:t>
+      </w:r>
+      <w:r>
+        <w:rPr>
+          <w:rStyle w:val="NormalTok"/>
+        </w:rPr>
+        <w:t xml:space="preserve"> db/migrations/004_form_reference.sql </w:t>
+      </w:r>
+      <w:r>
+        <w:rPr>
+          <w:rStyle w:val="CommentTok"/>
+        </w:rPr>
+        <w:t xml:space="preserve"># adds squat/deadlift/etc. form angles (matches by name)</w:t>
+      </w:r>
+      <w:r>
+        <w:br/>
+      </w:r>
+      <w:r>
+        <w:rPr>
+          <w:rStyle w:val="ExtensionTok"/>
+        </w:rPr>
+        <w:t xml:space="preserve">\q</w:t>
+      </w:r>
+    </w:p>
+    <w:p>
+      <w:pPr>
+        <w:numPr>
+          <w:ilvl w:val="0"/>
+          <w:numId w:val="1008"/>
+        </w:numPr>
+      </w:pPr>
+      <w:r>
+        <w:t xml:space="preserve">☐</w:t>
+      </w:r>
+      <w:r>
+        <w:t xml:space="preserve"> </w:t>
+      </w:r>
+      <w:r>
+        <w:rPr>
+          <w:b/>
+          <w:bCs/>
+        </w:rPr>
+        <w:t xml:space="preserve">Verify</w:t>
+      </w:r>
+      <w:r>
+        <w:t xml:space="preserve"> </w:t>
+      </w:r>
+      <w:r>
+        <w:t xml:space="preserve">in psql:</w:t>
       </w:r>
       <w:r>
         <w:t xml:space="preserve"> </w:t>
@@ -3414,7 +4150,7 @@
         <w:t xml:space="preserve"> </w:t>
       </w:r>
       <w:r>
-        <w:t xml:space="preserve">→ ~7,800+, and</w:t>
+        <w:t xml:space="preserve">and</w:t>
       </w:r>
       <w:r>
         <w:t xml:space="preserve"> </w:t>
@@ -3429,12 +4165,81 @@
         <w:t xml:space="preserve"> </w:t>
       </w:r>
       <w:r>
-        <w:t xml:space="preserve">returns banana rows.</w:t>
+        <w:t xml:space="preserve">returns banana rows;</w:t>
+      </w:r>
+      <w:r>
+        <w:t xml:space="preserve"> </w:t>
+      </w:r>
+      <w:r>
+        <w:rPr>
+          <w:rStyle w:val="VerbatimChar"/>
+        </w:rPr>
+        <w:t xml:space="preserve">SELECT count(*) FROM exercises;</w:t>
+      </w:r>
+      <w:r>
+        <w:t xml:space="preserve"> </w:t>
+      </w:r>
+      <w:r>
+        <w:t xml:space="preserve">≈ 870.</w:t>
       </w:r>
     </w:p>
     <w:p>
       <w:pPr>
         <w:pStyle w:val="FirstParagraph"/>
+      </w:pPr>
+      <w:r>
+        <w:t xml:space="preserve">ℹ️</w:t>
+      </w:r>
+      <w:r>
+        <w:t xml:space="preserve"> </w:t>
+      </w:r>
+      <w:r>
+        <w:rPr>
+          <w:b/>
+          <w:bCs/>
+        </w:rPr>
+        <w:t xml:space="preserve">Refreshing later:</w:t>
+      </w:r>
+      <w:r>
+        <w:t xml:space="preserve"> </w:t>
+      </w:r>
+      <w:r>
+        <w:t xml:space="preserve">re-run the dataprep scripts on new dumps, re-load staging, and re-run</w:t>
+      </w:r>
+      <w:r>
+        <w:t xml:space="preserve"> </w:t>
+      </w:r>
+      <w:r>
+        <w:rPr>
+          <w:rStyle w:val="VerbatimChar"/>
+        </w:rPr>
+        <w:t xml:space="preserve">transform.sql</w:t>
+      </w:r>
+      <w:r>
+        <w:t xml:space="preserve"> </w:t>
+      </w:r>
+      <w:r>
+        <w:t xml:space="preserve">+</w:t>
+      </w:r>
+      <w:r>
+        <w:t xml:space="preserve"> </w:t>
+      </w:r>
+      <w:r>
+        <w:rPr>
+          <w:rStyle w:val="VerbatimChar"/>
+        </w:rPr>
+        <w:t xml:space="preserve">004</w:t>
+      </w:r>
+      <w:r>
+        <w:t xml:space="preserve"> </w:t>
+      </w:r>
+      <w:r>
+        <w:t xml:space="preserve">— it’s a full rebuild each time, so it’s safe to repeat.</w:t>
+      </w:r>
+    </w:p>
+    <w:p>
+      <w:pPr>
+        <w:pStyle w:val="BodyText"/>
       </w:pPr>
       <w:r>
         <w:rPr>

</xml_diff>

<commit_message>
Optimize food DB for full-dataset scale (fast load + indexed lookups)
- food-db.ts: use the pg_trgm % operator so lookups hit the GIN index
  instead of seq-scanning millions of rows (verified via EXPLAIN ->
  Bitmap Index Scan); similarity() now only filters the candidate set
- transform.sql: UNLOGGED staging, drop foods indexes before the bulk
  insert and rebuild them after with maintenance_work_mem raised
- NEXT_STEPS: commit to the full USDA+OFF datasets and recommend a
  db-custom-2-8192 instance for the load/runtime

https://claude.ai/code/session_01UXdhGZHGoxWXnLXwftq8xW
</commit_message>
<xml_diff>
--- a/NEXT_STEPS.docx
+++ b/NEXT_STEPS.docx
@@ -2447,44 +2447,13 @@
           <w:b/>
           <w:bCs/>
         </w:rPr>
-        <w:t xml:space="preserve">Instance sizing.</w:t>
-      </w:r>
-      <w:r>
-        <w:t xml:space="preserve"> </w:t>
-      </w:r>
-      <w:r>
-        <w:t xml:space="preserve">If you load the</w:t>
-      </w:r>
-      <w:r>
-        <w:t xml:space="preserve"> </w:t>
-      </w:r>
-      <w:r>
-        <w:rPr>
-          <w:i/>
-          <w:iCs/>
-        </w:rPr>
-        <w:t xml:space="preserve">full</w:t>
-      </w:r>
-      <w:r>
-        <w:t xml:space="preserve"> </w:t>
-      </w:r>
-      <w:r>
-        <w:t xml:space="preserve">USDA Branded + Open Food Facts sets (millions of rows + a trigram index), the smallest</w:t>
-      </w:r>
-      <w:r>
-        <w:t xml:space="preserve"> </w:t>
-      </w:r>
-      <w:r>
-        <w:rPr>
-          <w:rStyle w:val="VerbatimChar"/>
-        </w:rPr>
-        <w:t xml:space="preserve">db-f1-micro</w:t>
-      </w:r>
-      <w:r>
-        <w:t xml:space="preserve"> </w:t>
-      </w:r>
-      <w:r>
-        <w:t xml:space="preserve">will be slow and may run out of memory building the index. For the full datasets, pick at least a</w:t>
+        <w:t xml:space="preserve">Instance sizing — you’re loading the FULL datasets (~5M food rows).</w:t>
+      </w:r>
+      <w:r>
+        <w:t xml:space="preserve"> </w:t>
+      </w:r>
+      <w:r>
+        <w:t xml:space="preserve">Use a</w:t>
       </w:r>
       <w:r>
         <w:t xml:space="preserve"> </w:t>
@@ -2500,38 +2469,86 @@
         <w:t xml:space="preserve"> </w:t>
       </w:r>
       <w:r>
-        <w:t xml:space="preserve">instance (~₹6,000–9,000/mo) for the load, then you can scale it down afterward. If you stick to the</w:t>
-      </w:r>
-      <w:r>
-        <w:t xml:space="preserve"> </w:t>
-      </w:r>
-      <w:r>
-        <w:rPr>
-          <w:b/>
-          <w:bCs/>
-        </w:rPr>
-        <w:t xml:space="preserve">generic whole-foods</w:t>
-      </w:r>
-      <w:r>
-        <w:t xml:space="preserve"> </w:t>
-      </w:r>
-      <w:r>
-        <w:t xml:space="preserve">sets (USDA Foundation + SR Legacy + Survey ≈ 20–30k foods),</w:t>
-      </w:r>
-      <w:r>
-        <w:t xml:space="preserve"> </w:t>
-      </w:r>
-      <w:r>
-        <w:rPr>
-          <w:rStyle w:val="VerbatimChar"/>
-        </w:rPr>
-        <w:t xml:space="preserve">db-f1-micro</w:t>
-      </w:r>
-      <w:r>
-        <w:t xml:space="preserve"> </w:t>
-      </w:r>
-      <w:r>
-        <w:t xml:space="preserve">(~₹1,500–2,500/mo) is fine. Decide based on whether you need branded/packaged products.</w:t>
+        <w:t xml:space="preserve">instance (</w:t>
+      </w:r>
+      <w:r>
+        <w:rPr>
+          <w:rStyle w:val="VerbatimChar"/>
+        </w:rPr>
+        <w:t xml:space="preserve">db-custom-2-8192</w:t>
+      </w:r>
+      <w:r>
+        <w:t xml:space="preserve">, ~₹6,000–9,000/mo) for the load and runtime. The load itself is already optimized in this repo: the staging tables are</w:t>
+      </w:r>
+      <w:r>
+        <w:t xml:space="preserve"> </w:t>
+      </w:r>
+      <w:r>
+        <w:rPr>
+          <w:rStyle w:val="VerbatimChar"/>
+        </w:rPr>
+        <w:t xml:space="preserve">UNLOGGED</w:t>
+      </w:r>
+      <w:r>
+        <w:t xml:space="preserve"> </w:t>
+      </w:r>
+      <w:r>
+        <w:t xml:space="preserve">and the trigram index is dropped before the insert and rebuilt in bulk afterward (</w:t>
+      </w:r>
+      <w:r>
+        <w:rPr>
+          <w:rStyle w:val="VerbatimChar"/>
+        </w:rPr>
+        <w:t xml:space="preserve">db/load/transform.sql</w:t>
+      </w:r>
+      <w:r>
+        <w:t xml:space="preserve"> </w:t>
+      </w:r>
+      <w:r>
+        <w:t xml:space="preserve">sets</w:t>
+      </w:r>
+      <w:r>
+        <w:t xml:space="preserve"> </w:t>
+      </w:r>
+      <w:r>
+        <w:rPr>
+          <w:rStyle w:val="VerbatimChar"/>
+        </w:rPr>
+        <w:t xml:space="preserve">maintenance_work_mem='1GB'</w:t>
+      </w:r>
+      <w:r>
+        <w:t xml:space="preserve"> </w:t>
+      </w:r>
+      <w:r>
+        <w:t xml:space="preserve">— lower that one line if your instance has &lt; 8 GB). The app’s food lookup is GIN-index-accelerated (verified with</w:t>
+      </w:r>
+      <w:r>
+        <w:t xml:space="preserve"> </w:t>
+      </w:r>
+      <w:r>
+        <w:rPr>
+          <w:rStyle w:val="VerbatimChar"/>
+        </w:rPr>
+        <w:t xml:space="preserve">EXPLAIN</w:t>
+      </w:r>
+      <w:r>
+        <w:t xml:space="preserve">), so searches stay fast on millions of rows. You can scale the instance down after launch if traffic is low, but keep</w:t>
+      </w:r>
+      <w:r>
+        <w:t xml:space="preserve"> </w:t>
+      </w:r>
+      <w:r>
+        <w:rPr>
+          <w:b/>
+          <w:bCs/>
+        </w:rPr>
+        <w:t xml:space="preserve">≥ 1 vCPU / 4 GB</w:t>
+      </w:r>
+      <w:r>
+        <w:t xml:space="preserve"> </w:t>
+      </w:r>
+      <w:r>
+        <w:t xml:space="preserve">so the ~2–3 GB trigram index stays cached for fast lookups.</w:t>
       </w:r>
     </w:p>
     <w:p>
@@ -2668,30 +2685,16 @@
       <w:r>
         <w:rPr>
           <w:rStyle w:val="VerbatimChar"/>
-        </w:rPr>
-        <w:t xml:space="preserve">db-f1-micro</w:t>
-      </w:r>
-      <w:r>
-        <w:t xml:space="preserve"> </w:t>
-      </w:r>
-      <w:r>
-        <w:t xml:space="preserve">for generic foods only,</w:t>
-      </w:r>
-      <w:r>
-        <w:t xml:space="preserve"> </w:t>
-      </w:r>
-      <w:r>
-        <w:rPr>
-          <w:b/>
-          <w:bCs/>
-        </w:rPr>
-        <w:t xml:space="preserve">or</w:t>
-      </w:r>
-      <w:r>
-        <w:t xml:space="preserve"> </w:t>
-      </w:r>
-      <w:r>
-        <w:t xml:space="preserve">a 2 vCPU / 8 GB tier if loading the full branded/OFF sets (see the warning above)</w:t>
+          <w:b/>
+          <w:bCs/>
+        </w:rPr>
+        <w:t xml:space="preserve">db-custom-2-8192</w:t>
+      </w:r>
+      <w:r>
+        <w:t xml:space="preserve"> </w:t>
+      </w:r>
+      <w:r>
+        <w:t xml:space="preserve">(2 vCPU / 8 GB) — needed for the full datasets (see the warning above)</w:t>
       </w:r>
     </w:p>
     <w:p>

</xml_diff>